<commit_message>
Apply management decisions: owner, Texas 3-year rule, forfeiture clauses, revenue timing
Director of Financial Reporting and Analysis replaces the Controller as owner
of the quarterly review and annual filings. Texas 3-year rule adopted; the
1-year wage rule is not applied. Philly and TUR forfeiture clauses are not
relied on against an escheat claim. Fee checks stay in the ordinary matching
process and the year-end revenue true-up; only amounts written off at a
quarterly review are booked to revenue. Added the after-remittance process
(holder relief and reimbursement sections verified for all five states) and
a rollout note tab on the briefing doc. Workbook rebuilt; Summary still ties
to 226,764.46 with no figure change.

Co-Authored-By: Claude Fable 5.1 <noreply@anthropic.com>
Claude-Session: https://claude.ai/code/session_01SVpE7ymJvQuwNuD1Yq5LvD
</commit_message>
<xml_diff>
--- a/accrued-commissions-analysis/Accrued_Commissions_CFO_Controller_Briefing.docx
+++ b/accrued-commissions-analysis/Accrued_Commissions_CFO_Controller_Briefing.docx
@@ -55,7 +55,7 @@
           <w:rFonts w:ascii="Arial" w:hAnsi="Arial" w:eastAsia="Arial"/>
           <w:sz w:val="17"/>
         </w:rPr>
-        <w:t xml:space="preserve">Approve the remediation plan for the $226,764.46 of deposited but unapplied commission checks and sign off on the four decisions below. The plan resolves every item at or near its state dormancy threshold: pay the agent, refund the payer, remit to the state, or retain with counsel’s written support. Younger items stay in the ordinary application process. Every rule behind these figures was verified from the statute text and state treasury pages on 10/6/2026.</w:t>
+        <w:t xml:space="preserve">Approve the remediation plan for the $226,764.46 of deposited but unapplied commission checks and sign off on the four positions below. The plan resolves every item at or near its state dormancy threshold: pay the agent, refund the payer, remit to the state, or retain with counsel’s written support. Younger items stay in the ordinary application process. The Director of Financial Reporting and Analysis owns the quarterly review and the annual filings. Every rule behind these figures was verified from the statute text and state treasury pages on 10/6/2026.</w:t>
       </w:r>
     </w:p>
     <w:bookmarkEnd w:id="20"/>
@@ -1251,7 +1251,7 @@
           <w:rFonts w:ascii="Arial" w:hAnsi="Arial" w:eastAsia="Arial"/>
           <w:sz w:val="17"/>
         </w:rPr>
-        <w:t xml:space="preserve">The $20,825.00 of fee checks is transaction-fee and E&amp;O revenue and is booked now; the $2,058.33 of small items follows once each is confirmed as a fee. In the larger checks only the agent’s share is reportable; where the closing documents are missing it is the check less the standard fee at the lower tier, documented per item. Memo-flagged items go back to their payers. Nothing is written off to income because the owner is unknown.</w:t>
+        <w:t xml:space="preserve">The 48 fee checks, $20,825.00, and the 15 small items, $2,058.33, are company fees, not unclaimed property. They are not moved to revenue en masse: they stay in the accrued balance, are recognized when matched in the ordinary course, and are already captured by the year-end revenue true-up. At a quarterly review only an item being written off at that time is booked to revenue. In the larger checks only the agent’s share is reportable; where the closing documents are missing it is the check less the standard fee at the lower tier, documented per item. Memo-flagged items go back to their payers. Nothing is written off to income because the owner is unknown.</w:t>
       </w:r>
     </w:p>
     <w:bookmarkEnd w:id="23"/>
@@ -1280,7 +1280,7 @@
           <w:rFonts w:ascii="Arial" w:hAnsi="Arial" w:eastAsia="Arial"/>
           <w:sz w:val="17"/>
         </w:rPr>
-        <w:t xml:space="preserve">The cash is in the bank and carried as a liability, so the plan moves it out or recognizes it; none of it is an expense. Revenue: $20,825.00 now, up to $2,058.33 more, plus the company’s split of each larger check as it is matched. Cash out: up to $30,640.63 refunded to payers, and $13,407.75 paid to agents or remitted to states today, $21,256.75 by the cutoffs, at full check amounts. Under the Texas 1-year sensitivity the cash out would be $94,496.40 today and $106,204.14 by the cutoffs. Filing the Texas items without a voluntary disclosure agreement would add 10% interest a year and a 5% to 10% penalty.</w:t>
+        <w:t xml:space="preserve">The cash is in the bank and carried as a liability, so the plan moves it out or recognizes it; none of it is an expense. Revenue: nothing is booked up front; the fee checks are already captured by the year-end true-up, and the company’s split of each larger check is recognized as it is matched or written off. Cash out: up to $30,640.63 refunded to payers, and $13,407.75 paid to agents or remitted to states today, $21,256.75 by the cutoffs, at full check amounts. Under the Texas 1-year sensitivity the cash out would be $94,496.40 today and $106,204.14 by the cutoffs. Filing the Texas items without a voluntary disclosure agreement would add 10% interest a year and a 5% to 10% penalty.</w:t>
       </w:r>
     </w:p>
     <w:bookmarkEnd w:id="24"/>
@@ -1313,7 +1313,7 @@
           <w:rFonts w:ascii="Arial" w:hAnsi="Arial" w:eastAsia="Arial"/>
           <w:sz w:val="17"/>
         </w:rPr>
-        <w:t xml:space="preserve">Texas period. Adopt the 3-year general rule (Prop. Code 72.101). The 1-year rule uses the Labor Code 61.001 definition of wages, which excludes independent contractors, and Comptroller Pub. 96-478 lists commissions (MS02) at 3 years. Worth $81,088.65 today: $13,407.75 against $94,496.40.</w:t>
+        <w:t xml:space="preserve">Texas period: adopted at 3 years. The 1-year rule uses the Labor Code 61.001 definition of wages, which excludes independent contractors, and Comptroller Pub. 96-478 lists commissions (MS02) at 3 years. Worth $81,088.65 today: $13,407.75 against $94,496.40.</w:t>
       </w:r>
     </w:p>
     <w:p>
@@ -1330,7 +1330,7 @@
           <w:rFonts w:ascii="Arial" w:hAnsi="Arial" w:eastAsia="Arial"/>
           <w:sz w:val="17"/>
         </w:rPr>
-        <w:t xml:space="preserve">Philly forfeiture clause. Do not rely on the ICA’s 60-day incomplete-file forfeiture without counsel’s written support per item. Texas 74.308 and 74.309 and the Illinois, Florida and Alabama acts disregard contract-based limits; the Pennsylvania act is silent. Philly: $419.35 today, $4,829.35 by the cutoff.</w:t>
+        <w:t xml:space="preserve">Philly forfeiture clause: not relied on. Items past dormancy are paid or reported at the agent’s share regardless of the ICA’s 60-day incomplete-file clause. Texas 74.308 and 74.309 and the Illinois, Florida and Alabama acts disregard contract-based limits; the Pennsylvania act is silent. Philly: $419.35 today, $4,829.35 by the cutoff.</w:t>
       </w:r>
     </w:p>
     <w:p>
@@ -1422,7 +1422,7 @@
           <w:rFonts w:ascii="Arial" w:hAnsi="Arial" w:eastAsia="Arial"/>
           <w:sz w:val="17"/>
         </w:rPr>
-        <w:t xml:space="preserve">No court decision or Comptroller ruling specifically on broker-to-agent commissions was found; the Texas position rests on the statutory definitions and the Comptroller’s property-code table. Whether a court would enforce the Philly forfeiture clause against an escheat claim is unresolved. The deposit date stands in for the payable date. The fee-versus-agent split of each larger check is unknown until the closing file is pulled, so every figure is an upper bound. Texas VDA eligibility for a prior filer is not stated by the Comptroller. Missouri and DC were not researched. Item detail and sources are in the analysis workbook and the findings memo dated 10/6/2026.</w:t>
+        <w:t xml:space="preserve">No court decision or Comptroller ruling specifically on broker-to-agent commissions was found; the Texas position rests on the statutory definitions and the Comptroller’s property-code table and is adopted as policy. The forfeiture clauses are not relied on, so their enforceability does not matter. The deposit date stands in for the payable date. The fee-versus-agent split of each larger check is unknown until the closing file is pulled, so every figure is an upper bound. Texas VDA eligibility for a prior filer is not stated by the Comptroller. Missouri and DC were not researched. If an agent later submits the file for a commission already remitted, the agent is still paid and the company recovers the amount from the state (Texas 74.502). Item detail and sources are in the analysis workbook and the findings memo dated 10/6/2026.</w:t>
       </w:r>
     </w:p>
     <w:bookmarkEnd w:id="27"/>

</xml_diff>

<commit_message>
Trim the CFO briefing back to one page
Co-Authored-By: Claude Fable 5.1 <noreply@anthropic.com>
Claude-Session: https://claude.ai/code/session_01SVpE7ymJvQuwNuD1Yq5LvD
</commit_message>
<xml_diff>
--- a/accrued-commissions-analysis/Accrued_Commissions_CFO_Controller_Briefing.docx
+++ b/accrued-commissions-analysis/Accrued_Commissions_CFO_Controller_Briefing.docx
@@ -113,7 +113,7 @@
           <w:rFonts w:ascii="Arial" w:hAnsi="Arial" w:eastAsia="Arial"/>
           <w:sz w:val="17"/>
         </w:rPr>
-        <w:t xml:space="preserve">Of the larger and memo-flagged items, $13,407.75 is past its dormancy period today and $21,256.75 will be by the next state cutoffs. Texas governs five of the seven entities, including unknown-agent items at Chicago and Philly, because those LLCs were formed in Texas. The Texas test for contractor commissions is the 3-year general rule: the 1-year rule covers only wages owed by an employer to an employee, and the Comptroller’s property-code table lists commissions at 3 years. The last two columns show the result if Texas were held to 1 year. All amounts are in dollars and are upper bounds at full check amounts.</w:t>
+        <w:t xml:space="preserve">Of the larger and memo-flagged items, $13,407.75 is past its dormancy period today and $21,256.75 will be by the next state cutoffs. Texas governs five of the seven entities, including unknown-agent items at Chicago and Philly, because those LLCs were formed in Texas. The Texas test for contractor commissions is the 3-year general rule: the 1-year rule covers only wages owed by an employer to an employee, and the Comptroller’s property-code table lists commissions at 3 years. Amounts are in dollars and are upper bounds at full check amounts.</w:t>
       </w:r>
     </w:p>
     <w:tbl>
@@ -1422,7 +1422,7 @@
           <w:rFonts w:ascii="Arial" w:hAnsi="Arial" w:eastAsia="Arial"/>
           <w:sz w:val="17"/>
         </w:rPr>
-        <w:t xml:space="preserve">No court decision or Comptroller ruling specifically on broker-to-agent commissions was found; the Texas position rests on the statutory definitions and the Comptroller’s property-code table and is adopted as policy. The forfeiture clauses are not relied on, so their enforceability does not matter. The deposit date stands in for the payable date. The fee-versus-agent split of each larger check is unknown until the closing file is pulled, so every figure is an upper bound. Texas VDA eligibility for a prior filer is not stated by the Comptroller. Missouri and DC were not researched. If an agent later submits the file for a commission already remitted, the agent is still paid and the company recovers the amount from the state (Texas 74.502). Item detail and sources are in the analysis workbook and the findings memo dated 10/6/2026.</w:t>
+        <w:t xml:space="preserve">No court decision or Comptroller ruling specifically on broker-to-agent commissions was found; the Texas position rests on the statutory definitions and the Comptroller’s property-code table and is adopted as policy. The forfeiture clauses are not relied on, so their enforceability does not matter. The deposit date stands in for the payable date. The fee-versus-agent split of each larger check is unknown until the closing file is pulled, so every figure is an upper bound. Texas VDA eligibility for a prior filer is not stated by the Comptroller. Missouri and DC were not researched. If an agent later submits the file for a remitted commission, the agent is still paid and the company recovers the amount from the state (Texas 74.502).</w:t>
       </w:r>
     </w:p>
     <w:bookmarkEnd w:id="27"/>

</xml_diff>

<commit_message>
Move the review to twice a year and document the cost of a missed cutoff
Review cadence is now early December (as of Nov 30, ahead of the Dec 31 and
March 1 cutoffs) and early June (as of May 31, ahead of the June 30 cutoff
and the July 1 Texas remittance), owned by the Director of Financial
Reporting and Analysis. The SOP, one-pager, workbook Gaps tab and README
now carry the verified interest, penalty, waiver and enforcement-window
rules for each state when a cutoff is missed. Figures unchanged.

Co-Authored-By: Claude Fable 5.1 <noreply@anthropic.com>
Claude-Session: https://claude.ai/code/session_01SVpE7ymJvQuwNuD1Yq5LvD
</commit_message>
<xml_diff>
--- a/accrued-commissions-analysis/Accrued_Commissions_CFO_Controller_Briefing.docx
+++ b/accrued-commissions-analysis/Accrued_Commissions_CFO_Controller_Briefing.docx
@@ -55,7 +55,7 @@
           <w:rFonts w:ascii="Arial" w:hAnsi="Arial" w:eastAsia="Arial"/>
           <w:sz w:val="17"/>
         </w:rPr>
-        <w:t xml:space="preserve">Approve the remediation plan for the $226,764.46 of deposited but unapplied commission checks and sign off on the four positions below. The plan resolves every item at or near its state dormancy threshold: pay the agent, refund the payer, remit to the state, or retain with counsel’s written support. Younger items stay in the ordinary application process. The Director of Financial Reporting and Analysis owns the quarterly review and the annual filings. Every rule behind these figures was verified from the statute text and state treasury pages on 10/6/2026.</w:t>
+        <w:t xml:space="preserve">Approve the remediation plan for the $226,764.46 of deposited but unapplied commission checks and sign off on the four positions below. The plan resolves every item at or near its state dormancy threshold: pay the agent, refund the payer, remit to the state, or retain with counsel’s written support. Younger items stay in the ordinary application process. The Director of Financial Reporting and Analysis runs the review twice a year, in early December and early June ahead of the state cutoffs, and owns the annual filings. Every rule behind these figures was verified from the statute text and state treasury pages on 10/6/2026.</w:t>
       </w:r>
     </w:p>
     <w:bookmarkEnd w:id="20"/>
@@ -84,7 +84,7 @@
           <w:rFonts w:ascii="Arial" w:hAnsi="Arial" w:eastAsia="Arial"/>
           <w:sz w:val="17"/>
         </w:rPr>
-        <w:t xml:space="preserve">As of 10/6/2026, 181 deposited checks not yet matched and booked in Sage total $226,764.46; a further $144,542.00 of September and October 2026 deposits is in normal workflow. Of the 181 items: 48 at exact fee amounts, $20,825.00; 15 small amounts, $2,058.33; 16 memo-flagged as not ours, unknown, duplicate or on hold, $30,640.63; and 102 larger checks that likely include an agent’s split, $173,240.50. By age: $114,234.35 is under one year, $57,512.62 one to two years, $40,304.24 two to three, and $14,713.25 three to five. The oldest item is a Houston deposit from 1/31/2022.</w:t>
+        <w:t xml:space="preserve">As of 10/6/2026, 181 deposited checks not yet matched and booked in Sage total $226,764.46; a further $144,542.00 of September and October 2026 deposits is in normal workflow. Of the 181 items: 48 at exact fee amounts, $20,825.00; 15 small amounts, $2,058.33; 16 memo-flagged as not ours, unknown, duplicate or on hold, $30,640.63; and 102 larger checks that likely include an agent’s split, $173,240.50. $14,713.25 is three to five years old and the oldest item is a Houston deposit from 1/31/2022.</w:t>
       </w:r>
     </w:p>
     <w:bookmarkEnd w:id="21"/>
@@ -113,7 +113,7 @@
           <w:rFonts w:ascii="Arial" w:hAnsi="Arial" w:eastAsia="Arial"/>
           <w:sz w:val="17"/>
         </w:rPr>
-        <w:t xml:space="preserve">Of the larger and memo-flagged items, $13,407.75 is past its dormancy period today and $21,256.75 will be by the next state cutoffs. Texas governs five of the seven entities, including unknown-agent items at Chicago and Philly, because those LLCs were formed in Texas. The Texas test for contractor commissions is the 3-year general rule: the 1-year rule covers only wages owed by an employer to an employee, and the Comptroller’s property-code table lists commissions at 3 years. Amounts are in dollars and are upper bounds at full check amounts.</w:t>
+        <w:t xml:space="preserve">Of the larger and memo-flagged items, $13,407.75 is past its dormancy period today and $21,256.75 will be by the next state cutoffs. Texas governs five of the seven entities, including unknown-agent items at Chicago and Philly, because those LLCs were formed in Texas. The Texas test for contractor commissions is the 3-year general rule: the 1-year rule covers only wages owed by an employer to an employee, and the Comptroller’s property-code table lists commissions at 3 years. Dollars; upper bounds at full check amounts.</w:t>
       </w:r>
     </w:p>
     <w:tbl>
@@ -155,7 +155,7 @@
             <w:r>
               <w:rPr>
                 <w:rFonts w:ascii="Arial" w:hAnsi="Arial" w:eastAsia="Arial"/>
-                <w:sz w:val="15"/>
+                <w:sz w:val="14"/>
               </w:rPr>
               <w:t xml:space="preserve">Entity</w:t>
             </w:r>
@@ -172,7 +172,7 @@
             <w:r>
               <w:rPr>
                 <w:rFonts w:ascii="Arial" w:hAnsi="Arial" w:eastAsia="Arial"/>
-                <w:sz w:val="15"/>
+                <w:sz w:val="14"/>
               </w:rPr>
               <w:t xml:space="preserve">State and test</w:t>
             </w:r>
@@ -189,7 +189,7 @@
             <w:r>
               <w:rPr>
                 <w:rFonts w:ascii="Arial" w:hAnsi="Arial" w:eastAsia="Arial"/>
-                <w:sz w:val="15"/>
+                <w:sz w:val="14"/>
               </w:rPr>
               <w:t xml:space="preserve">Balance</w:t>
             </w:r>
@@ -206,7 +206,7 @@
             <w:r>
               <w:rPr>
                 <w:rFonts w:ascii="Arial" w:hAnsi="Arial" w:eastAsia="Arial"/>
-                <w:sz w:val="15"/>
+                <w:sz w:val="14"/>
               </w:rPr>
               <w:t xml:space="preserve">Dormant today</w:t>
             </w:r>
@@ -223,7 +223,7 @@
             <w:r>
               <w:rPr>
                 <w:rFonts w:ascii="Arial" w:hAnsi="Arial" w:eastAsia="Arial"/>
-                <w:sz w:val="15"/>
+                <w:sz w:val="14"/>
               </w:rPr>
               <w:t xml:space="preserve">By next cutoff</w:t>
             </w:r>
@@ -240,7 +240,7 @@
             <w:r>
               <w:rPr>
                 <w:rFonts w:ascii="Arial" w:hAnsi="Arial" w:eastAsia="Arial"/>
-                <w:sz w:val="15"/>
+                <w:sz w:val="14"/>
               </w:rPr>
               <w:t xml:space="preserve">If TX 1 yr: today</w:t>
             </w:r>
@@ -257,7 +257,7 @@
             <w:r>
               <w:rPr>
                 <w:rFonts w:ascii="Arial" w:hAnsi="Arial" w:eastAsia="Arial"/>
-                <w:sz w:val="15"/>
+                <w:sz w:val="14"/>
               </w:rPr>
               <w:t xml:space="preserve">If TX 1 yr: cutoff</w:t>
             </w:r>
@@ -276,7 +276,7 @@
             <w:r>
               <w:rPr>
                 <w:rFonts w:ascii="Arial" w:hAnsi="Arial" w:eastAsia="Arial"/>
-                <w:sz w:val="15"/>
+                <w:sz w:val="14"/>
               </w:rPr>
               <w:t xml:space="preserve">Dallas</w:t>
             </w:r>
@@ -293,7 +293,7 @@
             <w:r>
               <w:rPr>
                 <w:rFonts w:ascii="Arial" w:hAnsi="Arial" w:eastAsia="Arial"/>
-                <w:sz w:val="15"/>
+                <w:sz w:val="14"/>
               </w:rPr>
               <w:t xml:space="preserve">TX, 3 yrs</w:t>
             </w:r>
@@ -310,7 +310,7 @@
             <w:r>
               <w:rPr>
                 <w:rFonts w:ascii="Arial" w:hAnsi="Arial" w:eastAsia="Arial"/>
-                <w:sz w:val="15"/>
+                <w:sz w:val="14"/>
               </w:rPr>
               <w:t xml:space="preserve">59,991.62</w:t>
             </w:r>
@@ -327,7 +327,7 @@
             <w:r>
               <w:rPr>
                 <w:rFonts w:ascii="Arial" w:hAnsi="Arial" w:eastAsia="Arial"/>
-                <w:sz w:val="15"/>
+                <w:sz w:val="14"/>
               </w:rPr>
               <w:t xml:space="preserve">6,707.80</w:t>
             </w:r>
@@ -344,7 +344,7 @@
             <w:r>
               <w:rPr>
                 <w:rFonts w:ascii="Arial" w:hAnsi="Arial" w:eastAsia="Arial"/>
-                <w:sz w:val="15"/>
+                <w:sz w:val="14"/>
               </w:rPr>
               <w:t xml:space="preserve">8,042.30</w:t>
             </w:r>
@@ -361,7 +361,7 @@
             <w:r>
               <w:rPr>
                 <w:rFonts w:ascii="Arial" w:hAnsi="Arial" w:eastAsia="Arial"/>
-                <w:sz w:val="15"/>
+                <w:sz w:val="14"/>
               </w:rPr>
               <w:t xml:space="preserve">17,639.54</w:t>
             </w:r>
@@ -378,7 +378,7 @@
             <w:r>
               <w:rPr>
                 <w:rFonts w:ascii="Arial" w:hAnsi="Arial" w:eastAsia="Arial"/>
-                <w:sz w:val="15"/>
+                <w:sz w:val="14"/>
               </w:rPr>
               <w:t xml:space="preserve">21,952.66</w:t>
             </w:r>
@@ -397,7 +397,7 @@
             <w:r>
               <w:rPr>
                 <w:rFonts w:ascii="Arial" w:hAnsi="Arial" w:eastAsia="Arial"/>
-                <w:sz w:val="15"/>
+                <w:sz w:val="14"/>
               </w:rPr>
               <w:t xml:space="preserve">Houston</w:t>
             </w:r>
@@ -414,7 +414,7 @@
             <w:r>
               <w:rPr>
                 <w:rFonts w:ascii="Arial" w:hAnsi="Arial" w:eastAsia="Arial"/>
-                <w:sz w:val="15"/>
+                <w:sz w:val="14"/>
               </w:rPr>
               <w:t xml:space="preserve">TX, 3 yrs</w:t>
             </w:r>
@@ -431,7 +431,7 @@
             <w:r>
               <w:rPr>
                 <w:rFonts w:ascii="Arial" w:hAnsi="Arial" w:eastAsia="Arial"/>
-                <w:sz w:val="15"/>
+                <w:sz w:val="14"/>
               </w:rPr>
               <w:t xml:space="preserve">76,889.50</w:t>
             </w:r>
@@ -448,7 +448,7 @@
             <w:r>
               <w:rPr>
                 <w:rFonts w:ascii="Arial" w:hAnsi="Arial" w:eastAsia="Arial"/>
-                <w:sz w:val="15"/>
+                <w:sz w:val="14"/>
               </w:rPr>
               <w:t xml:space="preserve">5,636.60</w:t>
             </w:r>
@@ -465,7 +465,7 @@
             <w:r>
               <w:rPr>
                 <w:rFonts w:ascii="Arial" w:hAnsi="Arial" w:eastAsia="Arial"/>
-                <w:sz w:val="15"/>
+                <w:sz w:val="14"/>
               </w:rPr>
               <w:t xml:space="preserve">6,011.60</w:t>
             </w:r>
@@ -482,7 +482,7 @@
             <w:r>
               <w:rPr>
                 <w:rFonts w:ascii="Arial" w:hAnsi="Arial" w:eastAsia="Arial"/>
-                <w:sz w:val="15"/>
+                <w:sz w:val="14"/>
               </w:rPr>
               <w:t xml:space="preserve">47,791.00</w:t>
             </w:r>
@@ -499,7 +499,7 @@
             <w:r>
               <w:rPr>
                 <w:rFonts w:ascii="Arial" w:hAnsi="Arial" w:eastAsia="Arial"/>
-                <w:sz w:val="15"/>
+                <w:sz w:val="14"/>
               </w:rPr>
               <w:t xml:space="preserve">48,641.00</w:t>
             </w:r>
@@ -518,7 +518,7 @@
             <w:r>
               <w:rPr>
                 <w:rFonts w:ascii="Arial" w:hAnsi="Arial" w:eastAsia="Arial"/>
-                <w:sz w:val="15"/>
+                <w:sz w:val="14"/>
               </w:rPr>
               <w:t xml:space="preserve">TUR</w:t>
             </w:r>
@@ -535,7 +535,7 @@
             <w:r>
               <w:rPr>
                 <w:rFonts w:ascii="Arial" w:hAnsi="Arial" w:eastAsia="Arial"/>
-                <w:sz w:val="15"/>
+                <w:sz w:val="14"/>
               </w:rPr>
               <w:t xml:space="preserve">TX, 3 yrs</w:t>
             </w:r>
@@ -552,7 +552,7 @@
             <w:r>
               <w:rPr>
                 <w:rFonts w:ascii="Arial" w:hAnsi="Arial" w:eastAsia="Arial"/>
-                <w:sz w:val="15"/>
+                <w:sz w:val="14"/>
               </w:rPr>
               <w:t xml:space="preserve">55,528.45</w:t>
             </w:r>
@@ -569,7 +569,7 @@
             <w:r>
               <w:rPr>
                 <w:rFonts w:ascii="Arial" w:hAnsi="Arial" w:eastAsia="Arial"/>
-                <w:sz w:val="15"/>
+                <w:sz w:val="14"/>
               </w:rPr>
               <w:t xml:space="preserve">644.00</w:t>
             </w:r>
@@ -586,7 +586,7 @@
             <w:r>
               <w:rPr>
                 <w:rFonts w:ascii="Arial" w:hAnsi="Arial" w:eastAsia="Arial"/>
-                <w:sz w:val="15"/>
+                <w:sz w:val="14"/>
               </w:rPr>
               <w:t xml:space="preserve">2,373.50</w:t>
             </w:r>
@@ -603,7 +603,7 @@
             <w:r>
               <w:rPr>
                 <w:rFonts w:ascii="Arial" w:hAnsi="Arial" w:eastAsia="Arial"/>
-                <w:sz w:val="15"/>
+                <w:sz w:val="14"/>
               </w:rPr>
               <w:t xml:space="preserve">13,942.20</w:t>
             </w:r>
@@ -620,7 +620,7 @@
             <w:r>
               <w:rPr>
                 <w:rFonts w:ascii="Arial" w:hAnsi="Arial" w:eastAsia="Arial"/>
-                <w:sz w:val="15"/>
+                <w:sz w:val="14"/>
               </w:rPr>
               <w:t xml:space="preserve">15,339.70</w:t>
             </w:r>
@@ -639,7 +639,7 @@
             <w:r>
               <w:rPr>
                 <w:rFonts w:ascii="Arial" w:hAnsi="Arial" w:eastAsia="Arial"/>
-                <w:sz w:val="15"/>
+                <w:sz w:val="14"/>
               </w:rPr>
               <w:t xml:space="preserve">Philly</w:t>
             </w:r>
@@ -656,7 +656,7 @@
             <w:r>
               <w:rPr>
                 <w:rFonts w:ascii="Arial" w:hAnsi="Arial" w:eastAsia="Arial"/>
-                <w:sz w:val="15"/>
+                <w:sz w:val="14"/>
               </w:rPr>
               <w:t xml:space="preserve">TX, 3 yrs (PA 2 yrs with a PA address)</w:t>
             </w:r>
@@ -673,7 +673,7 @@
             <w:r>
               <w:rPr>
                 <w:rFonts w:ascii="Arial" w:hAnsi="Arial" w:eastAsia="Arial"/>
-                <w:sz w:val="15"/>
+                <w:sz w:val="14"/>
               </w:rPr>
               <w:t xml:space="preserve">29,708.78</w:t>
             </w:r>
@@ -690,7 +690,7 @@
             <w:r>
               <w:rPr>
                 <w:rFonts w:ascii="Arial" w:hAnsi="Arial" w:eastAsia="Arial"/>
-                <w:sz w:val="15"/>
+                <w:sz w:val="14"/>
               </w:rPr>
               <w:t xml:space="preserve">419.35</w:t>
             </w:r>
@@ -707,7 +707,7 @@
             <w:r>
               <w:rPr>
                 <w:rFonts w:ascii="Arial" w:hAnsi="Arial" w:eastAsia="Arial"/>
-                <w:sz w:val="15"/>
+                <w:sz w:val="14"/>
               </w:rPr>
               <w:t xml:space="preserve">4,829.35</w:t>
             </w:r>
@@ -724,7 +724,7 @@
             <w:r>
               <w:rPr>
                 <w:rFonts w:ascii="Arial" w:hAnsi="Arial" w:eastAsia="Arial"/>
-                <w:sz w:val="15"/>
+                <w:sz w:val="14"/>
               </w:rPr>
               <w:t xml:space="preserve">15,123.66</w:t>
             </w:r>
@@ -741,7 +741,7 @@
             <w:r>
               <w:rPr>
                 <w:rFonts w:ascii="Arial" w:hAnsi="Arial" w:eastAsia="Arial"/>
-                <w:sz w:val="15"/>
+                <w:sz w:val="14"/>
               </w:rPr>
               <w:t xml:space="preserve">20,270.78</w:t>
             </w:r>
@@ -760,7 +760,7 @@
             <w:r>
               <w:rPr>
                 <w:rFonts w:ascii="Arial" w:hAnsi="Arial" w:eastAsia="Arial"/>
-                <w:sz w:val="15"/>
+                <w:sz w:val="14"/>
               </w:rPr>
               <w:t xml:space="preserve">Chicago</w:t>
             </w:r>
@@ -777,7 +777,7 @@
             <w:r>
               <w:rPr>
                 <w:rFonts w:ascii="Arial" w:hAnsi="Arial" w:eastAsia="Arial"/>
-                <w:sz w:val="15"/>
+                <w:sz w:val="14"/>
               </w:rPr>
               <w:t xml:space="preserve">TX, 3 yrs (IL 1 yr with an IL address)</w:t>
             </w:r>
@@ -794,7 +794,7 @@
             <w:r>
               <w:rPr>
                 <w:rFonts w:ascii="Arial" w:hAnsi="Arial" w:eastAsia="Arial"/>
-                <w:sz w:val="15"/>
+                <w:sz w:val="14"/>
               </w:rPr>
               <w:t xml:space="preserve">0.00</w:t>
             </w:r>
@@ -811,7 +811,7 @@
             <w:r>
               <w:rPr>
                 <w:rFonts w:ascii="Arial" w:hAnsi="Arial" w:eastAsia="Arial"/>
-                <w:sz w:val="15"/>
+                <w:sz w:val="14"/>
               </w:rPr>
               <w:t xml:space="preserve">0.00</w:t>
             </w:r>
@@ -828,7 +828,7 @@
             <w:r>
               <w:rPr>
                 <w:rFonts w:ascii="Arial" w:hAnsi="Arial" w:eastAsia="Arial"/>
-                <w:sz w:val="15"/>
+                <w:sz w:val="14"/>
               </w:rPr>
               <w:t xml:space="preserve">0.00</w:t>
             </w:r>
@@ -845,7 +845,7 @@
             <w:r>
               <w:rPr>
                 <w:rFonts w:ascii="Arial" w:hAnsi="Arial" w:eastAsia="Arial"/>
-                <w:sz w:val="15"/>
+                <w:sz w:val="14"/>
               </w:rPr>
               <w:t xml:space="preserve">0.00</w:t>
             </w:r>
@@ -862,7 +862,7 @@
             <w:r>
               <w:rPr>
                 <w:rFonts w:ascii="Arial" w:hAnsi="Arial" w:eastAsia="Arial"/>
-                <w:sz w:val="15"/>
+                <w:sz w:val="14"/>
               </w:rPr>
               <w:t xml:space="preserve">0.00</w:t>
             </w:r>
@@ -881,7 +881,7 @@
             <w:r>
               <w:rPr>
                 <w:rFonts w:ascii="Arial" w:hAnsi="Arial" w:eastAsia="Arial"/>
-                <w:sz w:val="15"/>
+                <w:sz w:val="14"/>
               </w:rPr>
               <w:t xml:space="preserve">Gallery</w:t>
             </w:r>
@@ -898,7 +898,7 @@
             <w:r>
               <w:rPr>
                 <w:rFonts w:ascii="Arial" w:hAnsi="Arial" w:eastAsia="Arial"/>
-                <w:sz w:val="15"/>
+                <w:sz w:val="14"/>
               </w:rPr>
               <w:t xml:space="preserve">FL, 3 yrs</w:t>
             </w:r>
@@ -915,7 +915,7 @@
             <w:r>
               <w:rPr>
                 <w:rFonts w:ascii="Arial" w:hAnsi="Arial" w:eastAsia="Arial"/>
-                <w:sz w:val="15"/>
+                <w:sz w:val="14"/>
               </w:rPr>
               <w:t xml:space="preserve">4,001.11</w:t>
             </w:r>
@@ -932,7 +932,7 @@
             <w:r>
               <w:rPr>
                 <w:rFonts w:ascii="Arial" w:hAnsi="Arial" w:eastAsia="Arial"/>
-                <w:sz w:val="15"/>
+                <w:sz w:val="14"/>
               </w:rPr>
               <w:t xml:space="preserve">0.00</w:t>
             </w:r>
@@ -949,7 +949,7 @@
             <w:r>
               <w:rPr>
                 <w:rFonts w:ascii="Arial" w:hAnsi="Arial" w:eastAsia="Arial"/>
-                <w:sz w:val="15"/>
+                <w:sz w:val="14"/>
               </w:rPr>
               <w:t xml:space="preserve">0.00</w:t>
             </w:r>
@@ -966,7 +966,7 @@
             <w:r>
               <w:rPr>
                 <w:rFonts w:ascii="Arial" w:hAnsi="Arial" w:eastAsia="Arial"/>
-                <w:sz w:val="15"/>
+                <w:sz w:val="14"/>
               </w:rPr>
               <w:t xml:space="preserve">0.00</w:t>
             </w:r>
@@ -983,7 +983,7 @@
             <w:r>
               <w:rPr>
                 <w:rFonts w:ascii="Arial" w:hAnsi="Arial" w:eastAsia="Arial"/>
-                <w:sz w:val="15"/>
+                <w:sz w:val="14"/>
               </w:rPr>
               <w:t xml:space="preserve">0.00</w:t>
             </w:r>
@@ -1002,7 +1002,7 @@
             <w:r>
               <w:rPr>
                 <w:rFonts w:ascii="Arial" w:hAnsi="Arial" w:eastAsia="Arial"/>
-                <w:sz w:val="15"/>
+                <w:sz w:val="14"/>
               </w:rPr>
               <w:t xml:space="preserve">Leading Edge</w:t>
             </w:r>
@@ -1019,7 +1019,7 @@
             <w:r>
               <w:rPr>
                 <w:rFonts w:ascii="Arial" w:hAnsi="Arial" w:eastAsia="Arial"/>
-                <w:sz w:val="15"/>
+                <w:sz w:val="14"/>
               </w:rPr>
               <w:t xml:space="preserve">AL, 1 yr</w:t>
             </w:r>
@@ -1036,7 +1036,7 @@
             <w:r>
               <w:rPr>
                 <w:rFonts w:ascii="Arial" w:hAnsi="Arial" w:eastAsia="Arial"/>
-                <w:sz w:val="15"/>
+                <w:sz w:val="14"/>
               </w:rPr>
               <w:t xml:space="preserve">645.00</w:t>
             </w:r>
@@ -1053,7 +1053,7 @@
             <w:r>
               <w:rPr>
                 <w:rFonts w:ascii="Arial" w:hAnsi="Arial" w:eastAsia="Arial"/>
-                <w:sz w:val="15"/>
+                <w:sz w:val="14"/>
               </w:rPr>
               <w:t xml:space="preserve">0.00</w:t>
             </w:r>
@@ -1070,7 +1070,7 @@
             <w:r>
               <w:rPr>
                 <w:rFonts w:ascii="Arial" w:hAnsi="Arial" w:eastAsia="Arial"/>
-                <w:sz w:val="15"/>
+                <w:sz w:val="14"/>
               </w:rPr>
               <w:t xml:space="preserve">0.00</w:t>
             </w:r>
@@ -1087,7 +1087,7 @@
             <w:r>
               <w:rPr>
                 <w:rFonts w:ascii="Arial" w:hAnsi="Arial" w:eastAsia="Arial"/>
-                <w:sz w:val="15"/>
+                <w:sz w:val="14"/>
               </w:rPr>
               <w:t xml:space="preserve">0.00</w:t>
             </w:r>
@@ -1104,7 +1104,7 @@
             <w:r>
               <w:rPr>
                 <w:rFonts w:ascii="Arial" w:hAnsi="Arial" w:eastAsia="Arial"/>
-                <w:sz w:val="15"/>
+                <w:sz w:val="14"/>
               </w:rPr>
               <w:t xml:space="preserve">0.00</w:t>
             </w:r>
@@ -1123,7 +1123,7 @@
             <w:r>
               <w:rPr>
                 <w:rFonts w:ascii="Arial" w:hAnsi="Arial" w:eastAsia="Arial"/>
-                <w:sz w:val="15"/>
+                <w:sz w:val="14"/>
               </w:rPr>
               <w:t xml:space="preserve">Total</w:t>
             </w:r>
@@ -1149,7 +1149,7 @@
             <w:r>
               <w:rPr>
                 <w:rFonts w:ascii="Arial" w:hAnsi="Arial" w:eastAsia="Arial"/>
-                <w:sz w:val="15"/>
+                <w:sz w:val="14"/>
               </w:rPr>
               <w:t xml:space="preserve">226,764.46</w:t>
             </w:r>
@@ -1166,7 +1166,7 @@
             <w:r>
               <w:rPr>
                 <w:rFonts w:ascii="Arial" w:hAnsi="Arial" w:eastAsia="Arial"/>
-                <w:sz w:val="15"/>
+                <w:sz w:val="14"/>
               </w:rPr>
               <w:t xml:space="preserve">13,407.75</w:t>
             </w:r>
@@ -1183,7 +1183,7 @@
             <w:r>
               <w:rPr>
                 <w:rFonts w:ascii="Arial" w:hAnsi="Arial" w:eastAsia="Arial"/>
-                <w:sz w:val="15"/>
+                <w:sz w:val="14"/>
               </w:rPr>
               <w:t xml:space="preserve">21,256.75</w:t>
             </w:r>
@@ -1200,7 +1200,7 @@
             <w:r>
               <w:rPr>
                 <w:rFonts w:ascii="Arial" w:hAnsi="Arial" w:eastAsia="Arial"/>
-                <w:sz w:val="15"/>
+                <w:sz w:val="14"/>
               </w:rPr>
               <w:t xml:space="preserve">94,496.40</w:t>
             </w:r>
@@ -1217,7 +1217,7 @@
             <w:r>
               <w:rPr>
                 <w:rFonts w:ascii="Arial" w:hAnsi="Arial" w:eastAsia="Arial"/>
-                <w:sz w:val="15"/>
+                <w:sz w:val="14"/>
               </w:rPr>
               <w:t xml:space="preserve">106,204.14</w:t>
             </w:r>
@@ -1251,7 +1251,7 @@
           <w:rFonts w:ascii="Arial" w:hAnsi="Arial" w:eastAsia="Arial"/>
           <w:sz w:val="17"/>
         </w:rPr>
-        <w:t xml:space="preserve">The 48 fee checks, $20,825.00, and the 15 small items, $2,058.33, are company fees, not unclaimed property. They are not moved to revenue en masse: they stay in the accrued balance, are recognized when matched in the ordinary course, and are already captured by the year-end revenue true-up. At a quarterly review only an item being written off at that time is booked to revenue. In the larger checks only the agent’s share is reportable; where the closing documents are missing it is the check less the standard fee at the lower tier, documented per item. Memo-flagged items go back to their payers. Nothing is written off to income because the owner is unknown.</w:t>
+        <w:t xml:space="preserve">The 48 fee checks, $20,825.00, and the 15 small items, $2,058.33, are company fees, not unclaimed property. They are not moved to revenue en masse: they stay in the accrued balance, are recognized when matched in the ordinary course, and are already captured by the year-end revenue true-up. At a review only an item being written off at that time is booked to revenue. In the larger checks only the agent’s share is reportable; where the closing documents are missing it is the check less the standard fee at the lower tier, documented per item. Memo-flagged items go back to their payers. Nothing is written off to income because the owner is unknown.</w:t>
       </w:r>
     </w:p>
     <w:bookmarkEnd w:id="23"/>
@@ -1280,7 +1280,7 @@
           <w:rFonts w:ascii="Arial" w:hAnsi="Arial" w:eastAsia="Arial"/>
           <w:sz w:val="17"/>
         </w:rPr>
-        <w:t xml:space="preserve">The cash is in the bank and carried as a liability, so the plan moves it out or recognizes it; none of it is an expense. Revenue: nothing is booked up front; the fee checks are already captured by the year-end true-up, and the company’s split of each larger check is recognized as it is matched or written off. Cash out: up to $30,640.63 refunded to payers, and $13,407.75 paid to agents or remitted to states today, $21,256.75 by the cutoffs, at full check amounts. Under the Texas 1-year sensitivity the cash out would be $94,496.40 today and $106,204.14 by the cutoffs. Filing the Texas items without a voluntary disclosure agreement would add 10% interest a year and a 5% to 10% penalty.</w:t>
+        <w:t xml:space="preserve">The cash is in the bank and carried as a liability, so the plan moves it out or recognizes it; none of it is an expense. Revenue: nothing is booked up front; the fee checks are already captured by the year-end true-up, and the company’s split of each larger check is recognized as it is matched or written off. Cash out: up to $30,640.63 refunded to payers, and $13,407.75 paid to agents or remitted to states today, $21,256.75 by the cutoffs, at full check amounts. A missed cutoff costs interest and penalties, not the property: Texas 10% a year plus 5% to 10% of the value; Pennsylvania 12% a year plus up to $1,000 a day; Florida up to $500 a day plus 25% of unreported value if wilful; Alabama $100 a business day. Each state waives for a good-faith holder, and the voluntary disclosure agreements waive them for the backlog.</w:t>
       </w:r>
     </w:p>
     <w:bookmarkEnd w:id="24"/>
@@ -1347,7 +1347,7 @@
           <w:rFonts w:ascii="Arial" w:hAnsi="Arial" w:eastAsia="Arial"/>
           <w:sz w:val="17"/>
         </w:rPr>
-        <w:t xml:space="preserve">Texas voluntary disclosure. Request one coordinated agreement for the five Texas LLCs before any Comptroller contact. It waives interest and penalty; the look-back is 10 years; the request is a short e-mail to the Comptroller’s holder reporting section.</w:t>
+        <w:t xml:space="preserve">Texas voluntary disclosure. Request one coordinated agreement for the five Texas LLCs before any Comptroller contact; it waives interest and penalty, and the look-back is 10 years.</w:t>
       </w:r>
     </w:p>
     <w:p>
@@ -1393,7 +1393,7 @@
           <w:rFonts w:ascii="Arial" w:hAnsi="Arial" w:eastAsia="Arial"/>
           <w:sz w:val="17"/>
         </w:rPr>
-        <w:t xml:space="preserve">By 12/31/2026: book the fee checks, refund the memo-flagged items, identify owners oldest first, deliver the counsel package, send the Texas VDA request. 12/31/2026 is the cutoff for Pennsylvania, Illinois and Florida; their letters go out 1/1/2027 to 2/14/2027. 3/1/2027 is the Texas cutoff; Texas letters go out by 5/2/2027. Reports and remittances: Pennsylvania 4/15/2027, Illinois and Florida 5/1/2027, Texas 7/1/2027; Alabama cutoff 6/30/2027, report 11/1/2027. Owners who answer a letter are paid directly.</w:t>
+        <w:t xml:space="preserve">First review in early December 2026, as of November 30: confirm the fee items, refund the memo-flagged items, identify owners oldest first, deliver the counsel package, send the Texas VDA request. 12/31/2026 is the cutoff for Pennsylvania, Illinois and Florida; their letters go out by 2/14/2027. 3/1/2027 is the Texas cutoff; Texas letters go out by 5/2/2027. Reports and remittances: Pennsylvania 4/15/2027, Illinois and Florida 5/1/2027, Texas 7/1/2027. Second review in early June 2027 for Alabama’s 6/30/2027 cutoff (report 11/1/2027) and the Texas remittance list.</w:t>
       </w:r>
     </w:p>
     <w:bookmarkEnd w:id="26"/>
@@ -1429,7 +1429,7 @@
     <w:bookmarkEnd w:id="28"/>
     <w:sectPr>
       <w:pgSz w:w="12240" w:h="15840"/>
-      <w:pgMar w:top="720" w:bottom="720" w:left="720" w:right="720"/>
+      <w:pgMar w:top="720" w:bottom="720" w:left="648" w:right="648"/>
     </w:sectPr>
   </w:body>
 </w:document>

</xml_diff>

<commit_message>
Move to one annual cycle: December review, January letters, statutory filing dates
A single review in early December (as of Nov 30) is projected to every
state cutoff; one batch of due-diligence letters goes out Jan 1 to Feb 14,
inside every state's window; reports are prepared together and submitted on
the statutory dates (PA Apr 15, IL and FL May 1, TX Jul 1, AL Nov 1). The
June review is dropped. SOP, one-pager, rollout note, workbook notes,
README and handoff updated. Figures unchanged.

Co-Authored-By: Claude Fable 5.1 <noreply@anthropic.com>
Claude-Session: https://claude.ai/code/session_01SVpE7ymJvQuwNuD1Yq5LvD
</commit_message>
<xml_diff>
--- a/accrued-commissions-analysis/Accrued_Commissions_CFO_Controller_Briefing.docx
+++ b/accrued-commissions-analysis/Accrued_Commissions_CFO_Controller_Briefing.docx
@@ -12,7 +12,7 @@
         <w:rPr>
           <w:rFonts w:ascii="Arial" w:hAnsi="Arial" w:eastAsia="Arial"/>
           <w:b/>
-          <w:sz w:val="19"/>
+          <w:sz w:val="18"/>
         </w:rPr>
         <w:t xml:space="preserve">Accrued Commissions Briefing for CFO and Controller</w:t>
       </w:r>
@@ -25,7 +25,7 @@
       <w:r>
         <w:rPr>
           <w:rFonts w:ascii="Arial" w:hAnsi="Arial" w:eastAsia="Arial"/>
-          <w:sz w:val="17"/>
+          <w:sz w:val="16"/>
         </w:rPr>
         <w:t xml:space="preserve">October 6, 2026. Prepared for the CFO and Controller. Snapshot of the Claude Doc; the doc is the editable master.</w:t>
       </w:r>
@@ -40,7 +40,7 @@
         <w:rPr>
           <w:rFonts w:ascii="Arial" w:hAnsi="Arial" w:eastAsia="Arial"/>
           <w:b/>
-          <w:sz w:val="19"/>
+          <w:sz w:val="18"/>
         </w:rPr>
         <w:t xml:space="preserve">Decision requested</w:t>
       </w:r>
@@ -53,9 +53,9 @@
       <w:r>
         <w:rPr>
           <w:rFonts w:ascii="Arial" w:hAnsi="Arial" w:eastAsia="Arial"/>
-          <w:sz w:val="17"/>
+          <w:sz w:val="16"/>
         </w:rPr>
-        <w:t xml:space="preserve">Approve the remediation plan for the $226,764.46 of deposited but unapplied commission checks and sign off on the four positions below. The plan resolves every item at or near its state dormancy threshold: pay the agent, refund the payer, remit to the state, or retain with counsel’s written support. Younger items stay in the ordinary application process. The Director of Financial Reporting and Analysis runs the review twice a year, in early December and early June ahead of the state cutoffs, and owns the annual filings. Every rule behind these figures was verified from the statute text and state treasury pages on 10/6/2026.</w:t>
+        <w:t xml:space="preserve">Approve the remediation plan for the $226,764.46 of deposited but unapplied commission checks and sign off on the four positions below. The plan resolves every item at or near its state dormancy threshold: pay the agent, refund the payer, remit to the state, or retain with counsel’s written support. Younger items stay in the ordinary application process. The Director of Financial Reporting and Analysis runs one review a year, in early December ahead of every state cutoff, and owns the filings. Every rule behind these figures was verified from the statute text and state treasury pages on 10/6/2026.</w:t>
       </w:r>
     </w:p>
     <w:bookmarkEnd w:id="20"/>
@@ -69,7 +69,7 @@
         <w:rPr>
           <w:rFonts w:ascii="Arial" w:hAnsi="Arial" w:eastAsia="Arial"/>
           <w:b/>
-          <w:sz w:val="19"/>
+          <w:sz w:val="18"/>
         </w:rPr>
         <w:t xml:space="preserve">The balance and what it is made of</w:t>
       </w:r>
@@ -82,7 +82,7 @@
       <w:r>
         <w:rPr>
           <w:rFonts w:ascii="Arial" w:hAnsi="Arial" w:eastAsia="Arial"/>
-          <w:sz w:val="17"/>
+          <w:sz w:val="16"/>
         </w:rPr>
         <w:t xml:space="preserve">As of 10/6/2026, 181 deposited checks not yet matched and booked in Sage total $226,764.46; a further $144,542.00 of September and October 2026 deposits is in normal workflow. Of the 181 items: 48 at exact fee amounts, $20,825.00; 15 small amounts, $2,058.33; 16 memo-flagged as not ours, unknown, duplicate or on hold, $30,640.63; and 102 larger checks that likely include an agent’s split, $173,240.50. $14,713.25 is three to five years old and the oldest item is a Houston deposit from 1/31/2022.</w:t>
       </w:r>
@@ -98,7 +98,7 @@
         <w:rPr>
           <w:rFonts w:ascii="Arial" w:hAnsi="Arial" w:eastAsia="Arial"/>
           <w:b/>
-          <w:sz w:val="19"/>
+          <w:sz w:val="18"/>
         </w:rPr>
         <w:t xml:space="preserve">Exposure under the verified rules</w:t>
       </w:r>
@@ -111,7 +111,7 @@
       <w:r>
         <w:rPr>
           <w:rFonts w:ascii="Arial" w:hAnsi="Arial" w:eastAsia="Arial"/>
-          <w:sz w:val="17"/>
+          <w:sz w:val="16"/>
         </w:rPr>
         <w:t xml:space="preserve">Of the larger and memo-flagged items, $13,407.75 is past its dormancy period today and $21,256.75 will be by the next state cutoffs. Texas governs five of the seven entities, including unknown-agent items at Chicago and Philly, because those LLCs were formed in Texas. The Texas test for contractor commissions is the 3-year general rule: the 1-year rule covers only wages owed by an employer to an employee, and the Comptroller’s property-code table lists commissions at 3 years. Dollars; upper bounds at full check amounts.</w:t>
       </w:r>
@@ -1236,7 +1236,7 @@
         <w:rPr>
           <w:rFonts w:ascii="Arial" w:hAnsi="Arial" w:eastAsia="Arial"/>
           <w:b/>
-          <w:sz w:val="19"/>
+          <w:sz w:val="18"/>
         </w:rPr>
         <w:t xml:space="preserve">What the company keeps and books to revenue</w:t>
       </w:r>
@@ -1249,7 +1249,7 @@
       <w:r>
         <w:rPr>
           <w:rFonts w:ascii="Arial" w:hAnsi="Arial" w:eastAsia="Arial"/>
-          <w:sz w:val="17"/>
+          <w:sz w:val="16"/>
         </w:rPr>
         <w:t xml:space="preserve">The 48 fee checks, $20,825.00, and the 15 small items, $2,058.33, are company fees, not unclaimed property. They are not moved to revenue en masse: they stay in the accrued balance, are recognized when matched in the ordinary course, and are already captured by the year-end revenue true-up. At a review only an item being written off at that time is booked to revenue. In the larger checks only the agent’s share is reportable; where the closing documents are missing it is the check less the standard fee at the lower tier, documented per item. Memo-flagged items go back to their payers. Nothing is written off to income because the owner is unknown.</w:t>
       </w:r>
@@ -1265,7 +1265,7 @@
         <w:rPr>
           <w:rFonts w:ascii="Arial" w:hAnsi="Arial" w:eastAsia="Arial"/>
           <w:b/>
-          <w:sz w:val="19"/>
+          <w:sz w:val="18"/>
         </w:rPr>
         <w:t xml:space="preserve">Cash and P&amp;L impact of the remediation plan</w:t>
       </w:r>
@@ -1278,7 +1278,7 @@
       <w:r>
         <w:rPr>
           <w:rFonts w:ascii="Arial" w:hAnsi="Arial" w:eastAsia="Arial"/>
-          <w:sz w:val="17"/>
+          <w:sz w:val="16"/>
         </w:rPr>
         <w:t xml:space="preserve">The cash is in the bank and carried as a liability, so the plan moves it out or recognizes it; none of it is an expense. Revenue: nothing is booked up front; the fee checks are already captured by the year-end true-up, and the company’s split of each larger check is recognized as it is matched or written off. Cash out: up to $30,640.63 refunded to payers, and $13,407.75 paid to agents or remitted to states today, $21,256.75 by the cutoffs, at full check amounts. A missed cutoff costs interest and penalties, not the property: Texas 10% a year plus 5% to 10% of the value; Pennsylvania 12% a year plus up to $1,000 a day; Florida up to $500 a day plus 25% of unreported value if wilful; Alabama $100 a business day. Each state waives for a good-faith holder, and the voluntary disclosure agreements waive them for the backlog.</w:t>
       </w:r>
@@ -1294,7 +1294,7 @@
         <w:rPr>
           <w:rFonts w:ascii="Arial" w:hAnsi="Arial" w:eastAsia="Arial"/>
           <w:b/>
-          <w:sz w:val="19"/>
+          <w:sz w:val="18"/>
         </w:rPr>
         <w:t xml:space="preserve">Four decisions that need your sign-off</w:t>
       </w:r>
@@ -1311,7 +1311,7 @@
       <w:r>
         <w:rPr>
           <w:rFonts w:ascii="Arial" w:hAnsi="Arial" w:eastAsia="Arial"/>
-          <w:sz w:val="17"/>
+          <w:sz w:val="16"/>
         </w:rPr>
         <w:t xml:space="preserve">Texas period: adopted at 3 years. The 1-year rule uses the Labor Code 61.001 definition of wages, which excludes independent contractors, and Comptroller Pub. 96-478 lists commissions (MS02) at 3 years. Worth $81,088.65 today: $13,407.75 against $94,496.40.</w:t>
       </w:r>
@@ -1328,7 +1328,7 @@
       <w:r>
         <w:rPr>
           <w:rFonts w:ascii="Arial" w:hAnsi="Arial" w:eastAsia="Arial"/>
-          <w:sz w:val="17"/>
+          <w:sz w:val="16"/>
         </w:rPr>
         <w:t xml:space="preserve">Philly forfeiture clause: not relied on. Items past dormancy are paid or reported at the agent’s share regardless of the ICA’s 60-day incomplete-file clause. Texas 74.308 and 74.309 and the Illinois, Florida and Alabama acts disregard contract-based limits; the Pennsylvania act is silent. Philly: $419.35 today, $4,829.35 by the cutoff.</w:t>
       </w:r>
@@ -1345,7 +1345,7 @@
       <w:r>
         <w:rPr>
           <w:rFonts w:ascii="Arial" w:hAnsi="Arial" w:eastAsia="Arial"/>
-          <w:sz w:val="17"/>
+          <w:sz w:val="16"/>
         </w:rPr>
         <w:t xml:space="preserve">Texas voluntary disclosure. Request one coordinated agreement for the five Texas LLCs before any Comptroller contact; it waives interest and penalty, and the look-back is 10 years.</w:t>
       </w:r>
@@ -1362,7 +1362,7 @@
       <w:r>
         <w:rPr>
           <w:rFonts w:ascii="Arial" w:hAnsi="Arial" w:eastAsia="Arial"/>
-          <w:sz w:val="17"/>
+          <w:sz w:val="16"/>
         </w:rPr>
         <w:t xml:space="preserve">Estimation rule. Where the Disbursement Authorization or Closing Disclosure cannot be found, set the agent’s share as the check less the standard fee, lower tier when the price is unknown, document it per item, and hold it in commissions payable until paid or remitted.</w:t>
       </w:r>
@@ -1378,7 +1378,7 @@
         <w:rPr>
           <w:rFonts w:ascii="Arial" w:hAnsi="Arial" w:eastAsia="Arial"/>
           <w:b/>
-          <w:sz w:val="19"/>
+          <w:sz w:val="18"/>
         </w:rPr>
         <w:t xml:space="preserve">Timeline to the 2027 filings</w:t>
       </w:r>
@@ -1391,9 +1391,9 @@
       <w:r>
         <w:rPr>
           <w:rFonts w:ascii="Arial" w:hAnsi="Arial" w:eastAsia="Arial"/>
-          <w:sz w:val="17"/>
+          <w:sz w:val="16"/>
         </w:rPr>
-        <w:t xml:space="preserve">First review in early December 2026, as of November 30: confirm the fee items, refund the memo-flagged items, identify owners oldest first, deliver the counsel package, send the Texas VDA request. 12/31/2026 is the cutoff for Pennsylvania, Illinois and Florida; their letters go out by 2/14/2027. 3/1/2027 is the Texas cutoff; Texas letters go out by 5/2/2027. Reports and remittances: Pennsylvania 4/15/2027, Illinois and Florida 5/1/2027, Texas 7/1/2027. Second review in early June 2027 for Alabama’s 6/30/2027 cutoff (report 11/1/2027) and the Texas remittance list.</w:t>
+        <w:t xml:space="preserve">One cycle a year. Before the first review: send the Texas VDA request, which must precede any Comptroller contact, and deliver the counsel package. Early December 2026, as of November 30: the review, projected to every cutoff (12/31/2026 for Pennsylvania, Illinois and Florida; 3/1/2027 for Texas; 6/30/2027 for Alabama). 1/1/2027 to 2/14/2027: one batch of due-diligence letters, which satisfies all five states. Reports prepared together and submitted on the statutory dates: Pennsylvania 4/15/2027, Illinois and Florida 5/1/2027, Texas 7/1/2027, Alabama 11/1/2027.</w:t>
       </w:r>
     </w:p>
     <w:bookmarkEnd w:id="26"/>
@@ -1407,7 +1407,7 @@
         <w:rPr>
           <w:rFonts w:ascii="Arial" w:hAnsi="Arial" w:eastAsia="Arial"/>
           <w:b/>
-          <w:sz w:val="19"/>
+          <w:sz w:val="18"/>
         </w:rPr>
         <w:t xml:space="preserve">What is still unverified</w:t>
       </w:r>
@@ -1420,7 +1420,7 @@
       <w:r>
         <w:rPr>
           <w:rFonts w:ascii="Arial" w:hAnsi="Arial" w:eastAsia="Arial"/>
-          <w:sz w:val="17"/>
+          <w:sz w:val="16"/>
         </w:rPr>
         <w:t xml:space="preserve">No court decision or Comptroller ruling specifically on broker-to-agent commissions was found; the Texas position rests on the statutory definitions and the Comptroller’s property-code table and is adopted as policy. The forfeiture clauses are not relied on, so their enforceability does not matter. The deposit date stands in for the payable date. The fee-versus-agent split of each larger check is unknown until the closing file is pulled, so every figure is an upper bound. Texas VDA eligibility for a prior filer is not stated by the Comptroller. Missouri and DC were not researched. If an agent later submits the file for a remitted commission, the agent is still paid and the company recovers the amount from the state (Texas 74.502).</w:t>
       </w:r>

</xml_diff>

<commit_message>
Drop the Texas 1-year sensitivity columns from the one-pager
The 3-year rule is adopted, so the sensitivity now lives only in the
workbook (Summary cols T-W). Briefing back to 9-point text on one page.

Co-Authored-By: Claude Fable 5.1 <noreply@anthropic.com>
Claude-Session: https://claude.ai/code/session_01SVpE7ymJvQuwNuD1Yq5LvD
</commit_message>
<xml_diff>
--- a/accrued-commissions-analysis/Accrued_Commissions_CFO_Controller_Briefing.docx
+++ b/accrued-commissions-analysis/Accrued_Commissions_CFO_Controller_Briefing.docx
@@ -12,7 +12,7 @@
         <w:rPr>
           <w:rFonts w:ascii="Arial" w:hAnsi="Arial" w:eastAsia="Arial"/>
           <w:b/>
-          <w:sz w:val="18"/>
+          <w:sz w:val="19"/>
         </w:rPr>
         <w:t xml:space="preserve">Accrued Commissions Briefing for CFO and Controller</w:t>
       </w:r>
@@ -25,7 +25,7 @@
       <w:r>
         <w:rPr>
           <w:rFonts w:ascii="Arial" w:hAnsi="Arial" w:eastAsia="Arial"/>
-          <w:sz w:val="16"/>
+          <w:sz w:val="17"/>
         </w:rPr>
         <w:t xml:space="preserve">October 6, 2026. Prepared for the CFO and Controller. Snapshot of the Claude Doc; the doc is the editable master.</w:t>
       </w:r>
@@ -40,7 +40,7 @@
         <w:rPr>
           <w:rFonts w:ascii="Arial" w:hAnsi="Arial" w:eastAsia="Arial"/>
           <w:b/>
-          <w:sz w:val="18"/>
+          <w:sz w:val="19"/>
         </w:rPr>
         <w:t xml:space="preserve">Decision requested</w:t>
       </w:r>
@@ -53,7 +53,7 @@
       <w:r>
         <w:rPr>
           <w:rFonts w:ascii="Arial" w:hAnsi="Arial" w:eastAsia="Arial"/>
-          <w:sz w:val="16"/>
+          <w:sz w:val="17"/>
         </w:rPr>
         <w:t xml:space="preserve">Approve the remediation plan for the $226,764.46 of deposited but unapplied commission checks and sign off on the four positions below. The plan resolves every item at or near its state dormancy threshold: pay the agent, refund the payer, remit to the state, or retain with counsel’s written support. Younger items stay in the ordinary application process. The Director of Financial Reporting and Analysis runs one review a year, in early December ahead of every state cutoff, and owns the filings. Every rule behind these figures was verified from the statute text and state treasury pages on 10/6/2026.</w:t>
       </w:r>
@@ -69,7 +69,7 @@
         <w:rPr>
           <w:rFonts w:ascii="Arial" w:hAnsi="Arial" w:eastAsia="Arial"/>
           <w:b/>
-          <w:sz w:val="18"/>
+          <w:sz w:val="19"/>
         </w:rPr>
         <w:t xml:space="preserve">The balance and what it is made of</w:t>
       </w:r>
@@ -82,7 +82,7 @@
       <w:r>
         <w:rPr>
           <w:rFonts w:ascii="Arial" w:hAnsi="Arial" w:eastAsia="Arial"/>
-          <w:sz w:val="16"/>
+          <w:sz w:val="17"/>
         </w:rPr>
         <w:t xml:space="preserve">As of 10/6/2026, 181 deposited checks not yet matched and booked in Sage total $226,764.46; a further $144,542.00 of September and October 2026 deposits is in normal workflow. Of the 181 items: 48 at exact fee amounts, $20,825.00; 15 small amounts, $2,058.33; 16 memo-flagged as not ours, unknown, duplicate or on hold, $30,640.63; and 102 larger checks that likely include an agent’s split, $173,240.50. $14,713.25 is three to five years old and the oldest item is a Houston deposit from 1/31/2022.</w:t>
       </w:r>
@@ -98,7 +98,7 @@
         <w:rPr>
           <w:rFonts w:ascii="Arial" w:hAnsi="Arial" w:eastAsia="Arial"/>
           <w:b/>
-          <w:sz w:val="18"/>
+          <w:sz w:val="19"/>
         </w:rPr>
         <w:t xml:space="preserve">Exposure under the verified rules</w:t>
       </w:r>
@@ -111,7 +111,7 @@
       <w:r>
         <w:rPr>
           <w:rFonts w:ascii="Arial" w:hAnsi="Arial" w:eastAsia="Arial"/>
-          <w:sz w:val="16"/>
+          <w:sz w:val="17"/>
         </w:rPr>
         <w:t xml:space="preserve">Of the larger and memo-flagged items, $13,407.75 is past its dormancy period today and $21,256.75 will be by the next state cutoffs. Texas governs five of the seven entities, including unknown-agent items at Chicago and Philly, because those LLCs were formed in Texas. The Texas test for contractor commissions is the 3-year general rule: the 1-year rule covers only wages owed by an employer to an employee, and the Comptroller’s property-code table lists commissions at 3 years. Dollars; upper bounds at full check amounts.</w:t>
       </w:r>
@@ -132,13 +132,11 @@
         </w:tblBorders>
       </w:tblPr>
       <w:tblGrid>
-        <w:gridCol w:w="1131"/>
-        <w:gridCol w:w="1131"/>
-        <w:gridCol w:w="1131"/>
-        <w:gridCol w:w="1131"/>
-        <w:gridCol w:w="1131"/>
-        <w:gridCol w:w="1131"/>
-        <w:gridCol w:w="1131"/>
+        <w:gridCol w:w="1584"/>
+        <w:gridCol w:w="1584"/>
+        <w:gridCol w:w="1584"/>
+        <w:gridCol w:w="1584"/>
+        <w:gridCol w:w="1584"/>
       </w:tblGrid>
       <w:tr>
         <w:trPr>
@@ -229,40 +227,6 @@
             </w:r>
           </w:p>
         </w:tc>
-        <w:tc>
-          <w:tcPr/>
-          <w:p>
-            <w:pPr>
-              <w:pStyle w:val="Compact"/>
-              <w:spacing w:after="0" w:before="0" w:line="240" w:lineRule="auto"/>
-              <w:jc w:val="right"/>
-            </w:pPr>
-            <w:r>
-              <w:rPr>
-                <w:rFonts w:ascii="Arial" w:hAnsi="Arial" w:eastAsia="Arial"/>
-                <w:sz w:val="14"/>
-              </w:rPr>
-              <w:t xml:space="preserve">If TX 1 yr: today</w:t>
-            </w:r>
-          </w:p>
-        </w:tc>
-        <w:tc>
-          <w:tcPr/>
-          <w:p>
-            <w:pPr>
-              <w:pStyle w:val="Compact"/>
-              <w:spacing w:after="0" w:before="0" w:line="240" w:lineRule="auto"/>
-              <w:jc w:val="right"/>
-            </w:pPr>
-            <w:r>
-              <w:rPr>
-                <w:rFonts w:ascii="Arial" w:hAnsi="Arial" w:eastAsia="Arial"/>
-                <w:sz w:val="14"/>
-              </w:rPr>
-              <w:t xml:space="preserve">If TX 1 yr: cutoff</w:t>
-            </w:r>
-          </w:p>
-        </w:tc>
       </w:tr>
       <w:tr>
         <w:tc>
@@ -350,40 +314,6 @@
             </w:r>
           </w:p>
         </w:tc>
-        <w:tc>
-          <w:tcPr/>
-          <w:p>
-            <w:pPr>
-              <w:pStyle w:val="Compact"/>
-              <w:spacing w:after="0" w:before="0" w:line="240" w:lineRule="auto"/>
-              <w:jc w:val="right"/>
-            </w:pPr>
-            <w:r>
-              <w:rPr>
-                <w:rFonts w:ascii="Arial" w:hAnsi="Arial" w:eastAsia="Arial"/>
-                <w:sz w:val="14"/>
-              </w:rPr>
-              <w:t xml:space="preserve">17,639.54</w:t>
-            </w:r>
-          </w:p>
-        </w:tc>
-        <w:tc>
-          <w:tcPr/>
-          <w:p>
-            <w:pPr>
-              <w:pStyle w:val="Compact"/>
-              <w:spacing w:after="0" w:before="0" w:line="240" w:lineRule="auto"/>
-              <w:jc w:val="right"/>
-            </w:pPr>
-            <w:r>
-              <w:rPr>
-                <w:rFonts w:ascii="Arial" w:hAnsi="Arial" w:eastAsia="Arial"/>
-                <w:sz w:val="14"/>
-              </w:rPr>
-              <w:t xml:space="preserve">21,952.66</w:t>
-            </w:r>
-          </w:p>
-        </w:tc>
       </w:tr>
       <w:tr>
         <w:tc>
@@ -471,40 +401,6 @@
             </w:r>
           </w:p>
         </w:tc>
-        <w:tc>
-          <w:tcPr/>
-          <w:p>
-            <w:pPr>
-              <w:pStyle w:val="Compact"/>
-              <w:spacing w:after="0" w:before="0" w:line="240" w:lineRule="auto"/>
-              <w:jc w:val="right"/>
-            </w:pPr>
-            <w:r>
-              <w:rPr>
-                <w:rFonts w:ascii="Arial" w:hAnsi="Arial" w:eastAsia="Arial"/>
-                <w:sz w:val="14"/>
-              </w:rPr>
-              <w:t xml:space="preserve">47,791.00</w:t>
-            </w:r>
-          </w:p>
-        </w:tc>
-        <w:tc>
-          <w:tcPr/>
-          <w:p>
-            <w:pPr>
-              <w:pStyle w:val="Compact"/>
-              <w:spacing w:after="0" w:before="0" w:line="240" w:lineRule="auto"/>
-              <w:jc w:val="right"/>
-            </w:pPr>
-            <w:r>
-              <w:rPr>
-                <w:rFonts w:ascii="Arial" w:hAnsi="Arial" w:eastAsia="Arial"/>
-                <w:sz w:val="14"/>
-              </w:rPr>
-              <w:t xml:space="preserve">48,641.00</w:t>
-            </w:r>
-          </w:p>
-        </w:tc>
       </w:tr>
       <w:tr>
         <w:tc>
@@ -592,40 +488,6 @@
             </w:r>
           </w:p>
         </w:tc>
-        <w:tc>
-          <w:tcPr/>
-          <w:p>
-            <w:pPr>
-              <w:pStyle w:val="Compact"/>
-              <w:spacing w:after="0" w:before="0" w:line="240" w:lineRule="auto"/>
-              <w:jc w:val="right"/>
-            </w:pPr>
-            <w:r>
-              <w:rPr>
-                <w:rFonts w:ascii="Arial" w:hAnsi="Arial" w:eastAsia="Arial"/>
-                <w:sz w:val="14"/>
-              </w:rPr>
-              <w:t xml:space="preserve">13,942.20</w:t>
-            </w:r>
-          </w:p>
-        </w:tc>
-        <w:tc>
-          <w:tcPr/>
-          <w:p>
-            <w:pPr>
-              <w:pStyle w:val="Compact"/>
-              <w:spacing w:after="0" w:before="0" w:line="240" w:lineRule="auto"/>
-              <w:jc w:val="right"/>
-            </w:pPr>
-            <w:r>
-              <w:rPr>
-                <w:rFonts w:ascii="Arial" w:hAnsi="Arial" w:eastAsia="Arial"/>
-                <w:sz w:val="14"/>
-              </w:rPr>
-              <w:t xml:space="preserve">15,339.70</w:t>
-            </w:r>
-          </w:p>
-        </w:tc>
       </w:tr>
       <w:tr>
         <w:tc>
@@ -713,40 +575,6 @@
             </w:r>
           </w:p>
         </w:tc>
-        <w:tc>
-          <w:tcPr/>
-          <w:p>
-            <w:pPr>
-              <w:pStyle w:val="Compact"/>
-              <w:spacing w:after="0" w:before="0" w:line="240" w:lineRule="auto"/>
-              <w:jc w:val="right"/>
-            </w:pPr>
-            <w:r>
-              <w:rPr>
-                <w:rFonts w:ascii="Arial" w:hAnsi="Arial" w:eastAsia="Arial"/>
-                <w:sz w:val="14"/>
-              </w:rPr>
-              <w:t xml:space="preserve">15,123.66</w:t>
-            </w:r>
-          </w:p>
-        </w:tc>
-        <w:tc>
-          <w:tcPr/>
-          <w:p>
-            <w:pPr>
-              <w:pStyle w:val="Compact"/>
-              <w:spacing w:after="0" w:before="0" w:line="240" w:lineRule="auto"/>
-              <w:jc w:val="right"/>
-            </w:pPr>
-            <w:r>
-              <w:rPr>
-                <w:rFonts w:ascii="Arial" w:hAnsi="Arial" w:eastAsia="Arial"/>
-                <w:sz w:val="14"/>
-              </w:rPr>
-              <w:t xml:space="preserve">20,270.78</w:t>
-            </w:r>
-          </w:p>
-        </w:tc>
       </w:tr>
       <w:tr>
         <w:tc>
@@ -834,40 +662,6 @@
             </w:r>
           </w:p>
         </w:tc>
-        <w:tc>
-          <w:tcPr/>
-          <w:p>
-            <w:pPr>
-              <w:pStyle w:val="Compact"/>
-              <w:spacing w:after="0" w:before="0" w:line="240" w:lineRule="auto"/>
-              <w:jc w:val="right"/>
-            </w:pPr>
-            <w:r>
-              <w:rPr>
-                <w:rFonts w:ascii="Arial" w:hAnsi="Arial" w:eastAsia="Arial"/>
-                <w:sz w:val="14"/>
-              </w:rPr>
-              <w:t xml:space="preserve">0.00</w:t>
-            </w:r>
-          </w:p>
-        </w:tc>
-        <w:tc>
-          <w:tcPr/>
-          <w:p>
-            <w:pPr>
-              <w:pStyle w:val="Compact"/>
-              <w:spacing w:after="0" w:before="0" w:line="240" w:lineRule="auto"/>
-              <w:jc w:val="right"/>
-            </w:pPr>
-            <w:r>
-              <w:rPr>
-                <w:rFonts w:ascii="Arial" w:hAnsi="Arial" w:eastAsia="Arial"/>
-                <w:sz w:val="14"/>
-              </w:rPr>
-              <w:t xml:space="preserve">0.00</w:t>
-            </w:r>
-          </w:p>
-        </w:tc>
       </w:tr>
       <w:tr>
         <w:tc>
@@ -955,40 +749,6 @@
             </w:r>
           </w:p>
         </w:tc>
-        <w:tc>
-          <w:tcPr/>
-          <w:p>
-            <w:pPr>
-              <w:pStyle w:val="Compact"/>
-              <w:spacing w:after="0" w:before="0" w:line="240" w:lineRule="auto"/>
-              <w:jc w:val="right"/>
-            </w:pPr>
-            <w:r>
-              <w:rPr>
-                <w:rFonts w:ascii="Arial" w:hAnsi="Arial" w:eastAsia="Arial"/>
-                <w:sz w:val="14"/>
-              </w:rPr>
-              <w:t xml:space="preserve">0.00</w:t>
-            </w:r>
-          </w:p>
-        </w:tc>
-        <w:tc>
-          <w:tcPr/>
-          <w:p>
-            <w:pPr>
-              <w:pStyle w:val="Compact"/>
-              <w:spacing w:after="0" w:before="0" w:line="240" w:lineRule="auto"/>
-              <w:jc w:val="right"/>
-            </w:pPr>
-            <w:r>
-              <w:rPr>
-                <w:rFonts w:ascii="Arial" w:hAnsi="Arial" w:eastAsia="Arial"/>
-                <w:sz w:val="14"/>
-              </w:rPr>
-              <w:t xml:space="preserve">0.00</w:t>
-            </w:r>
-          </w:p>
-        </w:tc>
       </w:tr>
       <w:tr>
         <w:tc>
@@ -1076,40 +836,6 @@
             </w:r>
           </w:p>
         </w:tc>
-        <w:tc>
-          <w:tcPr/>
-          <w:p>
-            <w:pPr>
-              <w:pStyle w:val="Compact"/>
-              <w:spacing w:after="0" w:before="0" w:line="240" w:lineRule="auto"/>
-              <w:jc w:val="right"/>
-            </w:pPr>
-            <w:r>
-              <w:rPr>
-                <w:rFonts w:ascii="Arial" w:hAnsi="Arial" w:eastAsia="Arial"/>
-                <w:sz w:val="14"/>
-              </w:rPr>
-              <w:t xml:space="preserve">0.00</w:t>
-            </w:r>
-          </w:p>
-        </w:tc>
-        <w:tc>
-          <w:tcPr/>
-          <w:p>
-            <w:pPr>
-              <w:pStyle w:val="Compact"/>
-              <w:spacing w:after="0" w:before="0" w:line="240" w:lineRule="auto"/>
-              <w:jc w:val="right"/>
-            </w:pPr>
-            <w:r>
-              <w:rPr>
-                <w:rFonts w:ascii="Arial" w:hAnsi="Arial" w:eastAsia="Arial"/>
-                <w:sz w:val="14"/>
-              </w:rPr>
-              <w:t xml:space="preserve">0.00</w:t>
-            </w:r>
-          </w:p>
-        </w:tc>
       </w:tr>
       <w:tr>
         <w:tc>
@@ -1186,40 +912,6 @@
                 <w:sz w:val="14"/>
               </w:rPr>
               <w:t xml:space="preserve">21,256.75</w:t>
-            </w:r>
-          </w:p>
-        </w:tc>
-        <w:tc>
-          <w:tcPr/>
-          <w:p>
-            <w:pPr>
-              <w:pStyle w:val="Compact"/>
-              <w:spacing w:after="0" w:before="0" w:line="240" w:lineRule="auto"/>
-              <w:jc w:val="right"/>
-            </w:pPr>
-            <w:r>
-              <w:rPr>
-                <w:rFonts w:ascii="Arial" w:hAnsi="Arial" w:eastAsia="Arial"/>
-                <w:sz w:val="14"/>
-              </w:rPr>
-              <w:t xml:space="preserve">94,496.40</w:t>
-            </w:r>
-          </w:p>
-        </w:tc>
-        <w:tc>
-          <w:tcPr/>
-          <w:p>
-            <w:pPr>
-              <w:pStyle w:val="Compact"/>
-              <w:spacing w:after="0" w:before="0" w:line="240" w:lineRule="auto"/>
-              <w:jc w:val="right"/>
-            </w:pPr>
-            <w:r>
-              <w:rPr>
-                <w:rFonts w:ascii="Arial" w:hAnsi="Arial" w:eastAsia="Arial"/>
-                <w:sz w:val="14"/>
-              </w:rPr>
-              <w:t xml:space="preserve">106,204.14</w:t>
             </w:r>
           </w:p>
         </w:tc>
@@ -1236,7 +928,7 @@
         <w:rPr>
           <w:rFonts w:ascii="Arial" w:hAnsi="Arial" w:eastAsia="Arial"/>
           <w:b/>
-          <w:sz w:val="18"/>
+          <w:sz w:val="19"/>
         </w:rPr>
         <w:t xml:space="preserve">What the company keeps and books to revenue</w:t>
       </w:r>
@@ -1249,7 +941,7 @@
       <w:r>
         <w:rPr>
           <w:rFonts w:ascii="Arial" w:hAnsi="Arial" w:eastAsia="Arial"/>
-          <w:sz w:val="16"/>
+          <w:sz w:val="17"/>
         </w:rPr>
         <w:t xml:space="preserve">The 48 fee checks, $20,825.00, and the 15 small items, $2,058.33, are company fees, not unclaimed property. They are not moved to revenue en masse: they stay in the accrued balance, are recognized when matched in the ordinary course, and are already captured by the year-end revenue true-up. At a review only an item being written off at that time is booked to revenue. In the larger checks only the agent’s share is reportable; where the closing documents are missing it is the check less the standard fee at the lower tier, documented per item. Memo-flagged items go back to their payers. Nothing is written off to income because the owner is unknown.</w:t>
       </w:r>
@@ -1265,7 +957,7 @@
         <w:rPr>
           <w:rFonts w:ascii="Arial" w:hAnsi="Arial" w:eastAsia="Arial"/>
           <w:b/>
-          <w:sz w:val="18"/>
+          <w:sz w:val="19"/>
         </w:rPr>
         <w:t xml:space="preserve">Cash and P&amp;L impact of the remediation plan</w:t>
       </w:r>
@@ -1278,7 +970,7 @@
       <w:r>
         <w:rPr>
           <w:rFonts w:ascii="Arial" w:hAnsi="Arial" w:eastAsia="Arial"/>
-          <w:sz w:val="16"/>
+          <w:sz w:val="17"/>
         </w:rPr>
         <w:t xml:space="preserve">The cash is in the bank and carried as a liability, so the plan moves it out or recognizes it; none of it is an expense. Revenue: nothing is booked up front; the fee checks are already captured by the year-end true-up, and the company’s split of each larger check is recognized as it is matched or written off. Cash out: up to $30,640.63 refunded to payers, and $13,407.75 paid to agents or remitted to states today, $21,256.75 by the cutoffs, at full check amounts. A missed cutoff costs interest and penalties, not the property: Texas 10% a year plus 5% to 10% of the value; Pennsylvania 12% a year plus up to $1,000 a day; Florida up to $500 a day plus 25% of unreported value if wilful; Alabama $100 a business day. Each state waives for a good-faith holder, and the voluntary disclosure agreements waive them for the backlog.</w:t>
       </w:r>
@@ -1294,7 +986,7 @@
         <w:rPr>
           <w:rFonts w:ascii="Arial" w:hAnsi="Arial" w:eastAsia="Arial"/>
           <w:b/>
-          <w:sz w:val="18"/>
+          <w:sz w:val="19"/>
         </w:rPr>
         <w:t xml:space="preserve">Four decisions that need your sign-off</w:t>
       </w:r>
@@ -1311,9 +1003,9 @@
       <w:r>
         <w:rPr>
           <w:rFonts w:ascii="Arial" w:hAnsi="Arial" w:eastAsia="Arial"/>
-          <w:sz w:val="16"/>
+          <w:sz w:val="17"/>
         </w:rPr>
-        <w:t xml:space="preserve">Texas period: adopted at 3 years. The 1-year rule uses the Labor Code 61.001 definition of wages, which excludes independent contractors, and Comptroller Pub. 96-478 lists commissions (MS02) at 3 years. Worth $81,088.65 today: $13,407.75 against $94,496.40.</w:t>
+        <w:t xml:space="preserve">Texas period: adopted at 3 years. The 1-year rule uses the Labor Code 61.001 definition of wages, which excludes independent contractors, and Comptroller Pub. 96-478 lists commissions (MS02) at 3 years.</w:t>
       </w:r>
     </w:p>
     <w:p>
@@ -1328,7 +1020,7 @@
       <w:r>
         <w:rPr>
           <w:rFonts w:ascii="Arial" w:hAnsi="Arial" w:eastAsia="Arial"/>
-          <w:sz w:val="16"/>
+          <w:sz w:val="17"/>
         </w:rPr>
         <w:t xml:space="preserve">Philly forfeiture clause: not relied on. Items past dormancy are paid or reported at the agent’s share regardless of the ICA’s 60-day incomplete-file clause. Texas 74.308 and 74.309 and the Illinois, Florida and Alabama acts disregard contract-based limits; the Pennsylvania act is silent. Philly: $419.35 today, $4,829.35 by the cutoff.</w:t>
       </w:r>
@@ -1345,7 +1037,7 @@
       <w:r>
         <w:rPr>
           <w:rFonts w:ascii="Arial" w:hAnsi="Arial" w:eastAsia="Arial"/>
-          <w:sz w:val="16"/>
+          <w:sz w:val="17"/>
         </w:rPr>
         <w:t xml:space="preserve">Texas voluntary disclosure. Request one coordinated agreement for the five Texas LLCs before any Comptroller contact; it waives interest and penalty, and the look-back is 10 years.</w:t>
       </w:r>
@@ -1362,7 +1054,7 @@
       <w:r>
         <w:rPr>
           <w:rFonts w:ascii="Arial" w:hAnsi="Arial" w:eastAsia="Arial"/>
-          <w:sz w:val="16"/>
+          <w:sz w:val="17"/>
         </w:rPr>
         <w:t xml:space="preserve">Estimation rule. Where the Disbursement Authorization or Closing Disclosure cannot be found, set the agent’s share as the check less the standard fee, lower tier when the price is unknown, document it per item, and hold it in commissions payable until paid or remitted.</w:t>
       </w:r>
@@ -1378,7 +1070,7 @@
         <w:rPr>
           <w:rFonts w:ascii="Arial" w:hAnsi="Arial" w:eastAsia="Arial"/>
           <w:b/>
-          <w:sz w:val="18"/>
+          <w:sz w:val="19"/>
         </w:rPr>
         <w:t xml:space="preserve">Timeline to the 2027 filings</w:t>
       </w:r>
@@ -1391,7 +1083,7 @@
       <w:r>
         <w:rPr>
           <w:rFonts w:ascii="Arial" w:hAnsi="Arial" w:eastAsia="Arial"/>
-          <w:sz w:val="16"/>
+          <w:sz w:val="17"/>
         </w:rPr>
         <w:t xml:space="preserve">One cycle a year. Before the first review: send the Texas VDA request, which must precede any Comptroller contact, and deliver the counsel package. Early December 2026, as of November 30: the review, projected to every cutoff (12/31/2026 for Pennsylvania, Illinois and Florida; 3/1/2027 for Texas; 6/30/2027 for Alabama). 1/1/2027 to 2/14/2027: one batch of due-diligence letters, which satisfies all five states. Reports prepared together and submitted on the statutory dates: Pennsylvania 4/15/2027, Illinois and Florida 5/1/2027, Texas 7/1/2027, Alabama 11/1/2027.</w:t>
       </w:r>
@@ -1407,7 +1099,7 @@
         <w:rPr>
           <w:rFonts w:ascii="Arial" w:hAnsi="Arial" w:eastAsia="Arial"/>
           <w:b/>
-          <w:sz w:val="18"/>
+          <w:sz w:val="19"/>
         </w:rPr>
         <w:t xml:space="preserve">What is still unverified</w:t>
       </w:r>
@@ -1420,7 +1112,7 @@
       <w:r>
         <w:rPr>
           <w:rFonts w:ascii="Arial" w:hAnsi="Arial" w:eastAsia="Arial"/>
-          <w:sz w:val="16"/>
+          <w:sz w:val="17"/>
         </w:rPr>
         <w:t xml:space="preserve">No court decision or Comptroller ruling specifically on broker-to-agent commissions was found; the Texas position rests on the statutory definitions and the Comptroller’s property-code table and is adopted as policy. The forfeiture clauses are not relied on, so their enforceability does not matter. The deposit date stands in for the payable date. The fee-versus-agent split of each larger check is unknown until the closing file is pulled, so every figure is an upper bound. Texas VDA eligibility for a prior filer is not stated by the Comptroller. Missouri and DC were not researched. If an agent later submits the file for a remitted commission, the agent is still paid and the company recovers the amount from the state (Texas 74.502).</w:t>
       </w:r>

</xml_diff>